<commit_message>
Filter trade bibliography for stock relevance
</commit_message>
<xml_diff>
--- a/paper/review_en.docx
+++ b/paper/review_en.docx
@@ -54,7 +54,7 @@
         <w:pStyle w:val="ListBullet"/>
       </w:pPr>
       <w:r>
-        <w:t>The 2,700 selected papers account for 982,704 citations in the selected set, with the largest citation mass in 2001.</w:t>
+        <w:t>The 2,700 selected papers account for 789,670 citations in the selected set, with the largest citation mass in 2001.</w:t>
       </w:r>
     </w:p>
     <w:p>
@@ -62,7 +62,7 @@
         <w:pStyle w:val="ListBullet"/>
       </w:pPr>
       <w:r>
-        <w:t>The largest category is General Finance, Surveys, and Trading Systems (776 papers).</w:t>
+        <w:t>The largest category is General Finance, Surveys, and Trading Systems (733 papers).</w:t>
       </w:r>
     </w:p>
     <w:p>
@@ -94,7 +94,7 @@
         <w:pStyle w:val="ListBullet"/>
       </w:pPr>
       <w:r>
-        <w:t>General Finance, Surveys, and Trading Systems: 776</w:t>
+        <w:t>General Finance, Surveys, and Trading Systems: 733</w:t>
       </w:r>
     </w:p>
     <w:p>
@@ -102,7 +102,7 @@
         <w:pStyle w:val="ListBullet"/>
       </w:pPr>
       <w:r>
-        <w:t>Risk, Volatility, and Forecast Evaluation: 364</w:t>
+        <w:t>Risk, Volatility, and Forecast Evaluation: 429</w:t>
       </w:r>
     </w:p>
     <w:p>
@@ -110,7 +110,7 @@
         <w:pStyle w:val="ListBullet"/>
       </w:pPr>
       <w:r>
-        <w:t>Asset Pricing and Return Predictability: 272</w:t>
+        <w:t>Asset Pricing and Return Predictability: 335</w:t>
       </w:r>
     </w:p>
     <w:p>
@@ -118,7 +118,7 @@
         <w:pStyle w:val="ListBullet"/>
       </w:pPr>
       <w:r>
-        <w:t>Reinforcement Learning and Algorithmic Trading: 265</w:t>
+        <w:t>Sentiment, News, and Alternative Data: 296</w:t>
       </w:r>
     </w:p>
     <w:p>
@@ -126,7 +126,7 @@
         <w:pStyle w:val="ListBullet"/>
       </w:pPr>
       <w:r>
-        <w:t>Sentiment, News, and Alternative Data: 263</w:t>
+        <w:t>Portfolio Optimization and Asset Allocation: 252</w:t>
       </w:r>
     </w:p>
     <w:p>
@@ -134,7 +134,7 @@
         <w:pStyle w:val="ListBullet"/>
       </w:pPr>
       <w:r>
-        <w:t>Deep Learning and Financial Time Series: 256</w:t>
+        <w:t>Deep Learning and Financial Time Series: 214</w:t>
       </w:r>
     </w:p>
     <w:p>
@@ -142,7 +142,7 @@
         <w:pStyle w:val="ListBullet"/>
       </w:pPr>
       <w:r>
-        <w:t>Portfolio Optimization and Asset Allocation: 187</w:t>
+        <w:t>Reinforcement Learning and Algorithmic Trading: 182</w:t>
       </w:r>
     </w:p>
     <w:p>
@@ -150,7 +150,7 @@
         <w:pStyle w:val="ListBullet"/>
       </w:pPr>
       <w:r>
-        <w:t>Machine Learning for Stock Prediction: 166</w:t>
+        <w:t>Market Microstructure and High-Frequency Trading: 153</w:t>
       </w:r>
     </w:p>
     <w:p>
@@ -158,7 +158,7 @@
         <w:pStyle w:val="ListBullet"/>
       </w:pPr>
       <w:r>
-        <w:t>Market Microstructure and High-Frequency Trading: 128</w:t>
+        <w:t>Machine Learning for Stock Prediction: 71</w:t>
       </w:r>
     </w:p>
     <w:p>
@@ -166,7 +166,7 @@
         <w:pStyle w:val="ListBullet"/>
       </w:pPr>
       <w:r>
-        <w:t>Behavioral Finance and Investor Decision-Making: 23</w:t>
+        <w:t>Behavioral Finance and Investor Decision-Making: 35</w:t>
       </w:r>
     </w:p>
     <w:p>
@@ -182,7 +182,7 @@
         <w:pStyle w:val="ListBullet"/>
       </w:pPr>
       <w:r>
-        <w:t>2000: 100 selected papers, 51,577 citations, top selected paper: Asset Pricing at the Millennium</w:t>
+        <w:t>2000: 100 selected papers, 50,901 citations, top selected paper: Asset Pricing at the Millennium</w:t>
       </w:r>
     </w:p>
     <w:p>
@@ -190,7 +190,7 @@
         <w:pStyle w:val="ListBullet"/>
       </w:pPr>
       <w:r>
-        <w:t>2001: 100 selected papers, 57,380 citations, top selected paper: Extreme Correlation of International Equity Markets</w:t>
+        <w:t>2001: 100 selected papers, 53,778 citations, top selected paper: Extreme Correlation of International Equity Markets</w:t>
       </w:r>
     </w:p>
     <w:p>
@@ -198,7 +198,7 @@
         <w:pStyle w:val="ListBullet"/>
       </w:pPr>
       <w:r>
-        <w:t>2002: 100 selected papers, 50,335 citations, top selected paper: Illiquidity and Stock Returns: Cross-Section and Time-Series Effects</w:t>
+        <w:t>2002: 100 selected papers, 42,298 citations, top selected paper: Illiquidity and Stock Returns: Cross-Section and Time-Series Effects</w:t>
       </w:r>
     </w:p>
     <w:p>
@@ -206,7 +206,7 @@
         <w:pStyle w:val="ListBullet"/>
       </w:pPr>
       <w:r>
-        <w:t>2003: 100 selected papers, 47,719 citations, top selected paper: MODELING AND FORECASTING REALIZED VOLATILITY</w:t>
+        <w:t>2003: 100 selected papers, 40,138 citations, top selected paper: MODELING AND FORECASTING REALIZED VOLATILITY</w:t>
       </w:r>
     </w:p>
     <w:p>
@@ -214,7 +214,7 @@
         <w:pStyle w:val="ListBullet"/>
       </w:pPr>
       <w:r>
-        <w:t>2004: 100 selected papers, 49,890 citations, top selected paper: Risks for the Long Run: A Potential Resolution of Asset Pricing Puzzles</w:t>
+        <w:t>2004: 100 selected papers, 42,252 citations, top selected paper: Risks for the Long Run: A Potential Resolution of Asset Pricing Puzzles</w:t>
       </w:r>
     </w:p>
     <w:p>
@@ -222,7 +222,7 @@
         <w:pStyle w:val="ListBullet"/>
       </w:pPr>
       <w:r>
-        <w:t>2005: 100 selected papers, 47,352 citations, top selected paper: Giving Content to Investor Sentiment: The Role of Media in the Stock Market</w:t>
+        <w:t>2005: 100 selected papers, 41,685 citations, top selected paper: Giving Content to Investor Sentiment: The Role of Media in the Stock Market</w:t>
       </w:r>
     </w:p>
     <w:p>
@@ -230,7 +230,7 @@
         <w:pStyle w:val="ListBullet"/>
       </w:pPr>
       <w:r>
-        <w:t>2006: 100 selected papers, 41,836 citations, top selected paper: Investor Sentiment and the Cross-Section of Stock Returns</w:t>
+        <w:t>2006: 100 selected papers, 39,573 citations, top selected paper: Investor Sentiment and the Cross-Section of Stock Returns</w:t>
       </w:r>
     </w:p>
     <w:p>
@@ -238,7 +238,7 @@
         <w:pStyle w:val="ListBullet"/>
       </w:pPr>
       <w:r>
-        <w:t>2007: 100 selected papers, 38,982 citations, top selected paper: MUTUAL FUND PERFORMANCE*</w:t>
+        <w:t>2007: 100 selected papers, 36,545 citations, top selected paper: MUTUAL FUND PERFORMANCE*</w:t>
       </w:r>
     </w:p>
     <w:p>
@@ -246,7 +246,7 @@
         <w:pStyle w:val="ListBullet"/>
       </w:pPr>
       <w:r>
-        <w:t>2008: 100 selected papers, 41,513 citations, top selected paper: Measuring Financial Asset Return and Volatility Spillovers, with Application to Global Equity Markets*</w:t>
+        <w:t>2008: 100 selected papers, 38,309 citations, top selected paper: Measuring Financial Asset Return and Volatility Spillovers, with Application to Global Equity Markets*</w:t>
       </w:r>
     </w:p>
     <w:p>
@@ -254,7 +254,7 @@
         <w:pStyle w:val="ListBullet"/>
       </w:pPr>
       <w:r>
-        <w:t>2009: 100 selected papers, 43,953 citations, top selected paper: Optimal Versus Naive Diversification: How Inefficient is the 1/N Portfolio Strategy?</w:t>
+        <w:t>2009: 100 selected papers, 40,313 citations, top selected paper: Optimal Versus Naive Diversification: How Inefficient is the 1/N Portfolio Strategy?</w:t>
       </w:r>
     </w:p>
     <w:p>
@@ -262,7 +262,7 @@
         <w:pStyle w:val="ListBullet"/>
       </w:pPr>
       <w:r>
-        <w:t>2010: 100 selected papers, 37,701 citations, top selected paper: Twitter mood predicts the stock market</w:t>
+        <w:t>2010: 100 selected papers, 32,551 citations, top selected paper: Twitter mood predicts the stock market</w:t>
       </w:r>
     </w:p>
     <w:p>
@@ -270,7 +270,7 @@
         <w:pStyle w:val="ListBullet"/>
       </w:pPr>
       <w:r>
-        <w:t>2011: 100 selected papers, 34,084 citations, top selected paper: Does the Stock Market Fully Value Intangibles? Employee Satisfaction and Equity Prices</w:t>
+        <w:t>2011: 100 selected papers, 31,243 citations, top selected paper: Does the Stock Market Fully Value Intangibles? Employee Satisfaction and Equity Prices</w:t>
       </w:r>
     </w:p>
     <w:p>
@@ -278,7 +278,7 @@
         <w:pStyle w:val="ListBullet"/>
       </w:pPr>
       <w:r>
-        <w:t>2012: 100 selected papers, 37,002 citations, top selected paper: Market Liquidity: Illiquidity and Stock Returns Cross-Section and Time-Series Effects＊</w:t>
+        <w:t>2012: 100 selected papers, 29,411 citations, top selected paper: Market Liquidity: Illiquidity and Stock Returns Cross-Section and Time-Series Effects＊</w:t>
       </w:r>
     </w:p>
     <w:p>
@@ -286,7 +286,7 @@
         <w:pStyle w:val="ListBullet"/>
       </w:pPr>
       <w:r>
-        <w:t>2013: 100 selected papers, 35,595 citations, top selected paper: A five-factor asset pricing model</w:t>
+        <w:t>2013: 100 selected papers, 33,132 citations, top selected paper: A five-factor asset pricing model</w:t>
       </w:r>
     </w:p>
     <w:p>
@@ -294,7 +294,7 @@
         <w:pStyle w:val="ListBullet"/>
       </w:pPr>
       <w:r>
-        <w:t>2014: 100 selected papers, 30,999 citations, top selected paper: The Cross Section of Expected Stock Returns</w:t>
+        <w:t>2014: 100 selected papers, 28,205 citations, top selected paper: The Cross Section of Expected Stock Returns</w:t>
       </w:r>
     </w:p>
     <w:p>
@@ -302,7 +302,7 @@
         <w:pStyle w:val="ListBullet"/>
       </w:pPr>
       <w:r>
-        <w:t>2015: 100 selected papers, 51,060 citations, top selected paper: SegNet: A Deep Convolutional Encoder-Decoder Architecture for Image Segmentation</w:t>
+        <w:t>2015: 100 selected papers, 25,285 citations, top selected paper: Predicting stock and stock price index movement using Trend Deterministic Data Preparation and machine learning techniques</w:t>
       </w:r>
     </w:p>
     <w:p>
@@ -310,7 +310,7 @@
         <w:pStyle w:val="ListBullet"/>
       </w:pPr>
       <w:r>
-        <w:t>2016: 100 selected papers, 26,012 citations, top selected paper: Training Deep Nets with Sublinear Memory Cost</w:t>
+        <w:t>2016: 100 selected papers, 20,081 citations, top selected paper: Does Academic Research Destroy Stock Return Predictability</w:t>
       </w:r>
     </w:p>
     <w:p>
@@ -318,7 +318,7 @@
         <w:pStyle w:val="ListBullet"/>
       </w:pPr>
       <w:r>
-        <w:t>2017: 100 selected papers, 41,195 citations, top selected paper: Arbitrary Style Transfer in Real-Time with Adaptive Instance Normalization</w:t>
+        <w:t>2017: 100 selected papers, 30,555 citations, top selected paper: Deep learning with long short-term memory networks for financial market predictions</w:t>
       </w:r>
     </w:p>
     <w:p>
@@ -326,7 +326,7 @@
         <w:pStyle w:val="ListBullet"/>
       </w:pPr>
       <w:r>
-        <w:t>2018: 100 selected papers, 40,175 citations, top selected paper: Reconciling modern machine-learning practice and the classical bias–variance trade-off</w:t>
+        <w:t>2018: 100 selected papers, 22,580 citations, top selected paper: Do shareholders benefit from green bonds?</w:t>
       </w:r>
     </w:p>
     <w:p>
@@ -334,7 +334,7 @@
         <w:pStyle w:val="ListBullet"/>
       </w:pPr>
       <w:r>
-        <w:t>2019: 100 selected papers, 43,754 citations, top selected paper: Theoretically Principled Trade-off between Robustness and Accuracy</w:t>
+        <w:t>2019: 100 selected papers, 25,570 citations, top selected paper: Financial Time Series Forecasting with Deep Learning : A Systematic Literature Review: 2005-2019</w:t>
       </w:r>
     </w:p>
     <w:p>
@@ -342,7 +342,7 @@
         <w:pStyle w:val="ListBullet"/>
       </w:pPr>
       <w:r>
-        <w:t>2020: 100 selected papers, 43,869 citations, top selected paper: Do investors care about carbon risk?</w:t>
+        <w:t>2020: 100 selected papers, 36,586 citations, top selected paper: Do investors care about carbon risk?</w:t>
       </w:r>
     </w:p>
     <w:p>
@@ -350,7 +350,7 @@
         <w:pStyle w:val="ListBullet"/>
       </w:pPr>
       <w:r>
-        <w:t>2021: 100 selected papers, 28,778 citations, top selected paper: Offline Reinforcement Learning with Implicit Q-Learning</w:t>
+        <w:t>2021: 100 selected papers, 18,971 citations, top selected paper: Global Pricing of Carbon-Transition Risk</w:t>
       </w:r>
     </w:p>
     <w:p>
@@ -358,7 +358,7 @@
         <w:pStyle w:val="ListBullet"/>
       </w:pPr>
       <w:r>
-        <w:t>2022: 100 selected papers, 19,723 citations, top selected paper: FlashAttention: Fast and Memory-Efficient Exact Attention with IO-Awareness</w:t>
+        <w:t>2022: 100 selected papers, 11,479 citations, top selected paper: Stock price reactions to ESG news: the role of ESG ratings and disagreement</w:t>
       </w:r>
     </w:p>
     <w:p>
@@ -366,7 +366,7 @@
         <w:pStyle w:val="ListBullet"/>
       </w:pPr>
       <w:r>
-        <w:t>2023: 100 selected papers, 25,444 citations, top selected paper: 3D Gaussian Splatting for Real-Time Radiance Field Rendering</w:t>
+        <w:t>2023: 100 selected papers, 9,978 citations, top selected paper: Assessing oil price volatility co-movement with stock market volatility through quantile regression approach</w:t>
       </w:r>
     </w:p>
     <w:p>
@@ -374,7 +374,7 @@
         <w:pStyle w:val="ListBullet"/>
       </w:pPr>
       <w:r>
-        <w:t>2024: 100 selected papers, 10,492 citations, top selected paper: Deep learning models for digital image processing: a review</w:t>
+        <w:t>2024: 100 selected papers, 5,525 citations, top selected paper: Corporate ESG rating divergence and excess stock returns</w:t>
       </w:r>
     </w:p>
     <w:p>
@@ -382,7 +382,7 @@
         <w:pStyle w:val="ListBullet"/>
       </w:pPr>
       <w:r>
-        <w:t>2025: 100 selected papers, 5,571 citations, top selected paper: The Entropy Mechanism of Reinforcement Learning for Reasoning Language Models</w:t>
+        <w:t>2025: 100 selected papers, 2,429 citations, top selected paper: LSTM–Transformer-Based Robust Hybrid Deep Learning Model for Financial Time Series Forecasting</w:t>
       </w:r>
     </w:p>
     <w:p>
@@ -390,7 +390,7 @@
         <w:pStyle w:val="ListBullet"/>
       </w:pPr>
       <w:r>
-        <w:t>2026: 100 selected papers, 713 citations, top selected paper: Mamba-3: Improved Sequence Modeling using State Space Principles</w:t>
+        <w:t>2026: 100 selected papers, 297 citations, top selected paper: Quantitative Finance</w:t>
       </w:r>
     </w:p>
     <w:p>
@@ -406,7 +406,7 @@
         <w:pStyle w:val="ListNumber"/>
       </w:pPr>
       <w:r>
-        <w:t>2015 #1: SegNet: A Deep Convolutional Encoder-Decoder Architecture for Image Segmentation (18,049 citations)</w:t>
+        <w:t>2014 #1: The Cross Section of Expected Stock Returns (6,364 citations)</w:t>
       </w:r>
     </w:p>
     <w:p>
@@ -414,7 +414,7 @@
         <w:pStyle w:val="ListNumber"/>
       </w:pPr>
       <w:r>
-        <w:t>2023 #2: 3D Gaussian Splatting for Real-Time Radiance Field Rendering (8,892 citations)</w:t>
+        <w:t>2013 #2: A five-factor asset pricing model (6,067 citations)</w:t>
       </w:r>
     </w:p>
     <w:p>
@@ -422,7 +422,7 @@
         <w:pStyle w:val="ListNumber"/>
       </w:pPr>
       <w:r>
-        <w:t>2014 #3: The Cross Section of Expected Stock Returns (6,364 citations)</w:t>
+        <w:t>2002 #3: Illiquidity and Stock Returns: Cross-Section and Time-Series Effects (5,951 citations)</w:t>
       </w:r>
     </w:p>
     <w:p>
@@ -430,7 +430,7 @@
         <w:pStyle w:val="ListNumber"/>
       </w:pPr>
       <w:r>
-        <w:t>2013 #4: A five-factor asset pricing model (6,067 citations)</w:t>
+        <w:t>2010 #4: Twitter mood predicts the stock market (5,405 citations)</w:t>
       </w:r>
     </w:p>
     <w:p>
@@ -438,7 +438,7 @@
         <w:pStyle w:val="ListNumber"/>
       </w:pPr>
       <w:r>
-        <w:t>2002 #5: Illiquidity and Stock Returns: Cross-Section and Time-Series Effects (5,951 citations)</w:t>
+        <w:t>2006 #5: Investor Sentiment and the Cross-Section of Stock Returns (5,404 citations)</w:t>
       </w:r>
     </w:p>
     <w:p>
@@ -446,7 +446,7 @@
         <w:pStyle w:val="ListNumber"/>
       </w:pPr>
       <w:r>
-        <w:t>2010 #6: Twitter mood predicts the stock market (5,405 citations)</w:t>
+        <w:t>2002 #6: No Contagion, Only Interdependence: Measuring Stock Market Comovements (4,552 citations)</w:t>
       </w:r>
     </w:p>
     <w:p>
@@ -454,7 +454,7 @@
         <w:pStyle w:val="ListNumber"/>
       </w:pPr>
       <w:r>
-        <w:t>2006 #7: Investor Sentiment and the Cross-Section of Stock Returns (5,404 citations)</w:t>
+        <w:t>2005 #7: Giving Content to Investor Sentiment: The Role of Media in the Stock Market (4,204 citations)</w:t>
       </w:r>
     </w:p>
     <w:p>
@@ -462,7 +462,7 @@
         <w:pStyle w:val="ListNumber"/>
       </w:pPr>
       <w:r>
-        <w:t>2017 #8: Arbitrary Style Transfer in Real-Time with Adaptive Instance Normalization (5,283 citations)</w:t>
+        <w:t>2004 #8: Risks for the Long Run: A Potential Resolution of Asset Pricing Puzzles (3,927 citations)</w:t>
       </w:r>
     </w:p>
     <w:p>
@@ -470,7 +470,7 @@
         <w:pStyle w:val="ListNumber"/>
       </w:pPr>
       <w:r>
-        <w:t>2002 #9: No Contagion, Only Interdependence: Measuring Stock Market Comovements (4,552 citations)</w:t>
+        <w:t>2000 #9: Asset Pricing at the Millennium (3,861 citations)</w:t>
       </w:r>
     </w:p>
     <w:p>
@@ -478,7 +478,7 @@
         <w:pStyle w:val="ListNumber"/>
       </w:pPr>
       <w:r>
-        <w:t>2022 #10: FlashAttention: Fast and Memory-Efficient Exact Attention with IO-Awareness (4,540 citations)</w:t>
+        <w:t>2003 #10: MODELING AND FORECASTING REALIZED VOLATILITY (3,768 citations)</w:t>
       </w:r>
     </w:p>
     <w:p>
@@ -486,7 +486,7 @@
         <w:pStyle w:val="ListNumber"/>
       </w:pPr>
       <w:r>
-        <w:t>2005 #11: Giving Content to Investor Sentiment: The Role of Media in the Stock Market (4,204 citations)</w:t>
+        <w:t>2007 #11: MUTUAL FUND PERFORMANCE* (3,461 citations)</w:t>
       </w:r>
     </w:p>
     <w:p>
@@ -494,7 +494,7 @@
         <w:pStyle w:val="ListNumber"/>
       </w:pPr>
       <w:r>
-        <w:t>2004 #12: Risks for the Long Run: A Potential Resolution of Asset Pricing Puzzles (3,927 citations)</w:t>
+        <w:t>2007 #12: Financial Literacy and Stock Market Participation (3,326 citations)</w:t>
       </w:r>
     </w:p>
     <w:p>

</xml_diff>